<commit_message>
docs: precisar la duracion de la corrida en el informe de la Guia 8
</commit_message>
<xml_diff>
--- a/docs/Guia8-Testing-Sprint3-MartilloERP.docx
+++ b/docs/Guia8-Testing-Sprint3-MartilloERP.docx
@@ -5231,7 +5231,7 @@
         <w:jc w:val="left"/>
       </w:pPr>
       <w:r>
-        <w:t>La corrida final del flujo de construcción sobre el commit e2ca984 terminó con éxito en sus dos trabajos. El backend ejecutó 49 pruebas en 62 segundos y la interfaz 13 pruebas en Chromium; ninguna falló ni quedó omitida. JaCoCo midió una cobertura de líneas del 89,9 % (525 de 584) y de ramas del 77,1 % (84 de 109), por encima del criterio de salida.</w:t>
+        <w:t>La corrida final del flujo de construcción sobre el commit e2ca984 terminó con éxito en sus dos trabajos. El trabajo del backend, que tardó 62 segundos, ejecutó 49 pruebas, y el de la interfaz ejecutó 13 en Chromium; ninguna falló ni quedó omitida. JaCoCo midió una cobertura de líneas del 89,9 % (525 de 584) y de ramas del 77,1 % (84 de 109), por encima del criterio de salida.</w:t>
       </w:r>
     </w:p>
     <w:p>
@@ -6124,7 +6124,7 @@
         <w:jc w:val="left"/>
       </w:pPr>
       <w:r>
-        <w:t>Los cambios se publicaron en la rama sprint3 del repositorio gustavo8015/martillo-erp, sin tocar develop ni main, en cuatro commits:</w:t>
+        <w:t>Los cambios se publicaron en la rama sprint3 del repositorio gustavo8015/martillo-erp, sin tocar develop ni main, en los siguientes commits:</w:t>
       </w:r>
     </w:p>
     <w:p>
@@ -6176,7 +6176,7 @@
         <w:jc w:val="left"/>
       </w:pPr>
       <w:r>
-        <w:t>Commit de documentación: plan de pruebas en docs/pruebas, evidencias de Playwright, sección de pruebas en el README y este informe en docs/.</w:t>
+        <w:t>86b4561 y commits posteriores de documentación: plan de pruebas en docs/pruebas, evidencias de Playwright, sección de pruebas en el README y este informe en docs/.</w:t>
       </w:r>
     </w:p>
     <w:p>

</xml_diff>

<commit_message>
docs: capturas de Jira con la evidencia de pruebas de la Guia 8
</commit_message>
<xml_diff>
--- a/docs/Guia8-Testing-Sprint3-MartilloERP.docx
+++ b/docs/Guia8-Testing-Sprint3-MartilloERP.docx
@@ -509,12 +509,12 @@
         <w:tabs>
           <w:tab w:pos="9360" w:val="right" w:leader="dot"/>
         </w:tabs>
-        <w:ind w:firstLine="0" w:left="0"/>
-      </w:pPr>
-      <w:r>
-        <w:t>LISTA COMPLETA EN ENLACES DEL PROYECTO</w:t>
+        <w:ind w:firstLine="0" w:left="720"/>
+      </w:pPr>
+      <w:r>
+        <w:t>Evidencias en Jira</w:t>
         <w:tab/>
-        <w:t>14</w:t>
+        <w:t>13</w:t>
       </w:r>
     </w:p>
     <w:p>
@@ -526,9 +526,9 @@
         <w:ind w:firstLine="0" w:left="0"/>
       </w:pPr>
       <w:r>
-        <w:t>CONCLUSIONES</w:t>
+        <w:t>LISTA COMPLETA EN ENLACES DEL PROYECTO</w:t>
         <w:tab/>
-        <w:t>16</w:t>
+        <w:t>18</w:t>
       </w:r>
     </w:p>
     <w:p>
@@ -540,9 +540,23 @@
         <w:ind w:firstLine="0" w:left="0"/>
       </w:pPr>
       <w:r>
+        <w:t>CONCLUSIONES</w:t>
+        <w:tab/>
+        <w:t>20</w:t>
+      </w:r>
+    </w:p>
+    <w:p>
+      <w:pPr>
+        <w:pStyle w:val="APA"/>
+        <w:tabs>
+          <w:tab w:pos="9360" w:val="right" w:leader="dot"/>
+        </w:tabs>
+        <w:ind w:firstLine="0" w:left="0"/>
+      </w:pPr>
+      <w:r>
         <w:t>REFERENCIAS</w:t>
         <w:tab/>
-        <w:t>17</w:t>
+        <w:t>21</w:t>
       </w:r>
     </w:p>
     <w:p>
@@ -6191,6 +6205,617 @@
     <w:p>
       <w:pPr>
         <w:pStyle w:val="APA"/>
+        <w:keepNext/>
+        <w:ind w:firstLine="0"/>
+        <w:jc w:val="left"/>
+      </w:pPr>
+      <w:r>
+        <w:rPr>
+          <w:b/>
+        </w:rPr>
+        <w:t>Evidencias en Jira</w:t>
+      </w:r>
+    </w:p>
+    <w:p>
+      <w:pPr>
+        <w:pStyle w:val="APA"/>
+        <w:jc w:val="left"/>
+      </w:pPr>
+      <w:r>
+        <w:t>El tablero del proyecto KAN registra la trazabilidad de la práctica. Cada historia del Sprint 3 recibió un comentario con los casos ejecutados, el enlace a la corrida de GitHub Actions y las capturas de Playwright correspondientes. Las Figuras 5 a 11 muestran ese registro.</w:t>
+      </w:r>
+    </w:p>
+    <w:p>
+      <w:pPr>
+        <w:pStyle w:val="APA"/>
+        <w:keepNext/>
+        <w:ind w:firstLine="0"/>
+      </w:pPr>
+      <w:r>
+        <w:rPr>
+          <w:b/>
+        </w:rPr>
+        <w:t>Figura 5</w:t>
+      </w:r>
+    </w:p>
+    <w:p>
+      <w:pPr>
+        <w:pStyle w:val="APA"/>
+        <w:keepNext/>
+        <w:ind w:firstLine="0"/>
+      </w:pPr>
+      <w:r>
+        <w:rPr>
+          <w:i/>
+        </w:rPr>
+        <w:t>Historias hijas de la épica KAN-56 en Jira</w:t>
+      </w:r>
+    </w:p>
+    <w:p>
+      <w:pPr>
+        <w:pStyle w:val="APA"/>
+        <w:keepNext/>
+        <w:ind w:firstLine="0"/>
+        <w:jc w:val="center"/>
+      </w:pPr>
+      <w:r>
+        <w:drawing>
+          <wp:inline xmlns:a="http://schemas.openxmlformats.org/drawingml/2006/main" xmlns:pic="http://schemas.openxmlformats.org/drawingml/2006/picture">
+            <wp:extent cx="5486400" cy="2305828"/>
+            <wp:docPr id="5" name="Picture 5"/>
+            <wp:cNvGraphicFramePr>
+              <a:graphicFrameLocks noChangeAspect="1"/>
+            </wp:cNvGraphicFramePr>
+            <a:graphic>
+              <a:graphicData uri="http://schemas.openxmlformats.org/drawingml/2006/picture">
+                <pic:pic>
+                  <pic:nvPicPr>
+                    <pic:cNvPr id="0" name="jira-01-historias-sprint3.jpg"/>
+                    <pic:cNvPicPr/>
+                  </pic:nvPicPr>
+                  <pic:blipFill>
+                    <a:blip r:embed="rId14"/>
+                    <a:stretch>
+                      <a:fillRect/>
+                    </a:stretch>
+                  </pic:blipFill>
+                  <pic:spPr>
+                    <a:xfrm>
+                      <a:off x="0" y="0"/>
+                      <a:ext cx="5486400" cy="2305828"/>
+                    </a:xfrm>
+                    <a:prstGeom prst="rect"/>
+                  </pic:spPr>
+                </pic:pic>
+              </a:graphicData>
+            </a:graphic>
+          </wp:inline>
+        </w:drawing>
+      </w:r>
+    </w:p>
+    <w:p>
+      <w:pPr>
+        <w:pStyle w:val="APA"/>
+        <w:ind w:firstLine="0"/>
+        <w:jc w:val="left"/>
+      </w:pPr>
+      <w:r>
+        <w:rPr>
+          <w:i/>
+        </w:rPr>
+        <w:t>Nota.</w:t>
+      </w:r>
+      <w:r>
+        <w:t xml:space="preserve"> Captura del tablero de Jira del proyecto KAN, 1 de octubre de 2026. Filtro por la épica principal del Sprint 3.</w:t>
+      </w:r>
+    </w:p>
+    <w:p>
+      <w:pPr>
+        <w:pStyle w:val="APA"/>
+        <w:keepNext/>
+        <w:ind w:firstLine="0"/>
+      </w:pPr>
+      <w:r>
+        <w:rPr>
+          <w:b/>
+        </w:rPr>
+        <w:t>Figura 6</w:t>
+      </w:r>
+    </w:p>
+    <w:p>
+      <w:pPr>
+        <w:pStyle w:val="APA"/>
+        <w:keepNext/>
+        <w:ind w:firstLine="0"/>
+      </w:pPr>
+      <w:r>
+        <w:rPr>
+          <w:i/>
+        </w:rPr>
+        <w:t>Épica KAN-56 del Sprint 3</w:t>
+      </w:r>
+    </w:p>
+    <w:p>
+      <w:pPr>
+        <w:pStyle w:val="APA"/>
+        <w:keepNext/>
+        <w:ind w:firstLine="0"/>
+        <w:jc w:val="center"/>
+      </w:pPr>
+      <w:r>
+        <w:drawing>
+          <wp:inline xmlns:a="http://schemas.openxmlformats.org/drawingml/2006/main" xmlns:pic="http://schemas.openxmlformats.org/drawingml/2006/picture">
+            <wp:extent cx="5486400" cy="2305828"/>
+            <wp:docPr id="6" name="Picture 6"/>
+            <wp:cNvGraphicFramePr>
+              <a:graphicFrameLocks noChangeAspect="1"/>
+            </wp:cNvGraphicFramePr>
+            <a:graphic>
+              <a:graphicData uri="http://schemas.openxmlformats.org/drawingml/2006/picture">
+                <pic:pic>
+                  <pic:nvPicPr>
+                    <pic:cNvPr id="0" name="jira-02-epica-kan56.jpg"/>
+                    <pic:cNvPicPr/>
+                  </pic:nvPicPr>
+                  <pic:blipFill>
+                    <a:blip r:embed="rId15"/>
+                    <a:stretch>
+                      <a:fillRect/>
+                    </a:stretch>
+                  </pic:blipFill>
+                  <pic:spPr>
+                    <a:xfrm>
+                      <a:off x="0" y="0"/>
+                      <a:ext cx="5486400" cy="2305828"/>
+                    </a:xfrm>
+                    <a:prstGeom prst="rect"/>
+                  </pic:spPr>
+                </pic:pic>
+              </a:graphicData>
+            </a:graphic>
+          </wp:inline>
+        </w:drawing>
+      </w:r>
+    </w:p>
+    <w:p>
+      <w:pPr>
+        <w:pStyle w:val="APA"/>
+        <w:ind w:firstLine="0"/>
+        <w:jc w:val="left"/>
+      </w:pPr>
+      <w:r>
+        <w:rPr>
+          <w:i/>
+        </w:rPr>
+        <w:t>Nota.</w:t>
+      </w:r>
+      <w:r>
+        <w:t xml:space="preserve"> Captura de Jira con el alcance comprometido de 27 puntos y las entregas del sprint.</w:t>
+      </w:r>
+    </w:p>
+    <w:p>
+      <w:pPr>
+        <w:pStyle w:val="APA"/>
+        <w:keepNext/>
+        <w:ind w:firstLine="0"/>
+      </w:pPr>
+      <w:r>
+        <w:rPr>
+          <w:b/>
+        </w:rPr>
+        <w:t>Figura 7</w:t>
+      </w:r>
+    </w:p>
+    <w:p>
+      <w:pPr>
+        <w:pStyle w:val="APA"/>
+        <w:keepNext/>
+        <w:ind w:firstLine="0"/>
+      </w:pPr>
+      <w:r>
+        <w:rPr>
+          <w:i/>
+        </w:rPr>
+        <w:t>Evidencia de pruebas registrada en KAN-57 (HU-07)</w:t>
+      </w:r>
+    </w:p>
+    <w:p>
+      <w:pPr>
+        <w:pStyle w:val="APA"/>
+        <w:keepNext/>
+        <w:ind w:firstLine="0"/>
+        <w:jc w:val="center"/>
+      </w:pPr>
+      <w:r>
+        <w:drawing>
+          <wp:inline xmlns:a="http://schemas.openxmlformats.org/drawingml/2006/main" xmlns:pic="http://schemas.openxmlformats.org/drawingml/2006/picture">
+            <wp:extent cx="5486400" cy="2308980"/>
+            <wp:docPr id="7" name="Picture 7"/>
+            <wp:cNvGraphicFramePr>
+              <a:graphicFrameLocks noChangeAspect="1"/>
+            </wp:cNvGraphicFramePr>
+            <a:graphic>
+              <a:graphicData uri="http://schemas.openxmlformats.org/drawingml/2006/picture">
+                <pic:pic>
+                  <pic:nvPicPr>
+                    <pic:cNvPr id="0" name="jira-03-kan57-hu07.jpg"/>
+                    <pic:cNvPicPr/>
+                  </pic:nvPicPr>
+                  <pic:blipFill>
+                    <a:blip r:embed="rId16"/>
+                    <a:stretch>
+                      <a:fillRect/>
+                    </a:stretch>
+                  </pic:blipFill>
+                  <pic:spPr>
+                    <a:xfrm>
+                      <a:off x="0" y="0"/>
+                      <a:ext cx="5486400" cy="2308980"/>
+                    </a:xfrm>
+                    <a:prstGeom prst="rect"/>
+                  </pic:spPr>
+                </pic:pic>
+              </a:graphicData>
+            </a:graphic>
+          </wp:inline>
+        </w:drawing>
+      </w:r>
+    </w:p>
+    <w:p>
+      <w:pPr>
+        <w:pStyle w:val="APA"/>
+        <w:ind w:firstLine="0"/>
+        <w:jc w:val="left"/>
+      </w:pPr>
+      <w:r>
+        <w:rPr>
+          <w:i/>
+        </w:rPr>
+        <w:t>Nota.</w:t>
+      </w:r>
+      <w:r>
+        <w:t xml:space="preserve"> Captura de Jira. Comentario de la Guía 8 en KAN-57 con los casos aprobados y la captura de Playwright de la historia.</w:t>
+      </w:r>
+    </w:p>
+    <w:p>
+      <w:pPr>
+        <w:pStyle w:val="APA"/>
+        <w:keepNext/>
+        <w:ind w:firstLine="0"/>
+      </w:pPr>
+      <w:r>
+        <w:rPr>
+          <w:b/>
+        </w:rPr>
+        <w:t>Figura 8</w:t>
+      </w:r>
+    </w:p>
+    <w:p>
+      <w:pPr>
+        <w:pStyle w:val="APA"/>
+        <w:keepNext/>
+        <w:ind w:firstLine="0"/>
+      </w:pPr>
+      <w:r>
+        <w:rPr>
+          <w:i/>
+        </w:rPr>
+        <w:t>Evidencia de pruebas registrada en KAN-58 (HU-08)</w:t>
+      </w:r>
+    </w:p>
+    <w:p>
+      <w:pPr>
+        <w:pStyle w:val="APA"/>
+        <w:keepNext/>
+        <w:ind w:firstLine="0"/>
+        <w:jc w:val="center"/>
+      </w:pPr>
+      <w:r>
+        <w:drawing>
+          <wp:inline xmlns:a="http://schemas.openxmlformats.org/drawingml/2006/main" xmlns:pic="http://schemas.openxmlformats.org/drawingml/2006/picture">
+            <wp:extent cx="5486400" cy="2308980"/>
+            <wp:docPr id="8" name="Picture 8"/>
+            <wp:cNvGraphicFramePr>
+              <a:graphicFrameLocks noChangeAspect="1"/>
+            </wp:cNvGraphicFramePr>
+            <a:graphic>
+              <a:graphicData uri="http://schemas.openxmlformats.org/drawingml/2006/picture">
+                <pic:pic>
+                  <pic:nvPicPr>
+                    <pic:cNvPr id="0" name="jira-04-kan58-hu08.jpg"/>
+                    <pic:cNvPicPr/>
+                  </pic:nvPicPr>
+                  <pic:blipFill>
+                    <a:blip r:embed="rId17"/>
+                    <a:stretch>
+                      <a:fillRect/>
+                    </a:stretch>
+                  </pic:blipFill>
+                  <pic:spPr>
+                    <a:xfrm>
+                      <a:off x="0" y="0"/>
+                      <a:ext cx="5486400" cy="2308980"/>
+                    </a:xfrm>
+                    <a:prstGeom prst="rect"/>
+                  </pic:spPr>
+                </pic:pic>
+              </a:graphicData>
+            </a:graphic>
+          </wp:inline>
+        </w:drawing>
+      </w:r>
+    </w:p>
+    <w:p>
+      <w:pPr>
+        <w:pStyle w:val="APA"/>
+        <w:ind w:firstLine="0"/>
+        <w:jc w:val="left"/>
+      </w:pPr>
+      <w:r>
+        <w:rPr>
+          <w:i/>
+        </w:rPr>
+        <w:t>Nota.</w:t>
+      </w:r>
+      <w:r>
+        <w:t xml:space="preserve"> Captura de Jira. Comentario de la Guía 8 en KAN-58 con los casos aprobados y la captura de Playwright de la historia.</w:t>
+      </w:r>
+    </w:p>
+    <w:p>
+      <w:pPr>
+        <w:pStyle w:val="APA"/>
+        <w:keepNext/>
+        <w:ind w:firstLine="0"/>
+      </w:pPr>
+      <w:r>
+        <w:rPr>
+          <w:b/>
+        </w:rPr>
+        <w:t>Figura 9</w:t>
+      </w:r>
+    </w:p>
+    <w:p>
+      <w:pPr>
+        <w:pStyle w:val="APA"/>
+        <w:keepNext/>
+        <w:ind w:firstLine="0"/>
+      </w:pPr>
+      <w:r>
+        <w:rPr>
+          <w:i/>
+        </w:rPr>
+        <w:t>Evidencia de pruebas registrada en KAN-59 (HU-09)</w:t>
+      </w:r>
+    </w:p>
+    <w:p>
+      <w:pPr>
+        <w:pStyle w:val="APA"/>
+        <w:keepNext/>
+        <w:ind w:firstLine="0"/>
+        <w:jc w:val="center"/>
+      </w:pPr>
+      <w:r>
+        <w:drawing>
+          <wp:inline xmlns:a="http://schemas.openxmlformats.org/drawingml/2006/main" xmlns:pic="http://schemas.openxmlformats.org/drawingml/2006/picture">
+            <wp:extent cx="5486400" cy="2308980"/>
+            <wp:docPr id="9" name="Picture 9"/>
+            <wp:cNvGraphicFramePr>
+              <a:graphicFrameLocks noChangeAspect="1"/>
+            </wp:cNvGraphicFramePr>
+            <a:graphic>
+              <a:graphicData uri="http://schemas.openxmlformats.org/drawingml/2006/picture">
+                <pic:pic>
+                  <pic:nvPicPr>
+                    <pic:cNvPr id="0" name="jira-05-kan59-hu09.jpg"/>
+                    <pic:cNvPicPr/>
+                  </pic:nvPicPr>
+                  <pic:blipFill>
+                    <a:blip r:embed="rId18"/>
+                    <a:stretch>
+                      <a:fillRect/>
+                    </a:stretch>
+                  </pic:blipFill>
+                  <pic:spPr>
+                    <a:xfrm>
+                      <a:off x="0" y="0"/>
+                      <a:ext cx="5486400" cy="2308980"/>
+                    </a:xfrm>
+                    <a:prstGeom prst="rect"/>
+                  </pic:spPr>
+                </pic:pic>
+              </a:graphicData>
+            </a:graphic>
+          </wp:inline>
+        </w:drawing>
+      </w:r>
+    </w:p>
+    <w:p>
+      <w:pPr>
+        <w:pStyle w:val="APA"/>
+        <w:ind w:firstLine="0"/>
+        <w:jc w:val="left"/>
+      </w:pPr>
+      <w:r>
+        <w:rPr>
+          <w:i/>
+        </w:rPr>
+        <w:t>Nota.</w:t>
+      </w:r>
+      <w:r>
+        <w:t xml:space="preserve"> Captura de Jira. Comentario de la Guía 8 en KAN-59 con los casos aprobados y la captura de Playwright de la historia.</w:t>
+      </w:r>
+    </w:p>
+    <w:p>
+      <w:pPr>
+        <w:pStyle w:val="APA"/>
+        <w:keepNext/>
+        <w:ind w:firstLine="0"/>
+      </w:pPr>
+      <w:r>
+        <w:rPr>
+          <w:b/>
+        </w:rPr>
+        <w:t>Figura 10</w:t>
+      </w:r>
+    </w:p>
+    <w:p>
+      <w:pPr>
+        <w:pStyle w:val="APA"/>
+        <w:keepNext/>
+        <w:ind w:firstLine="0"/>
+      </w:pPr>
+      <w:r>
+        <w:rPr>
+          <w:i/>
+        </w:rPr>
+        <w:t>Evidencia de pruebas registrada en KAN-60 (HU-10)</w:t>
+      </w:r>
+    </w:p>
+    <w:p>
+      <w:pPr>
+        <w:pStyle w:val="APA"/>
+        <w:keepNext/>
+        <w:ind w:firstLine="0"/>
+        <w:jc w:val="center"/>
+      </w:pPr>
+      <w:r>
+        <w:drawing>
+          <wp:inline xmlns:a="http://schemas.openxmlformats.org/drawingml/2006/main" xmlns:pic="http://schemas.openxmlformats.org/drawingml/2006/picture">
+            <wp:extent cx="5486400" cy="2308980"/>
+            <wp:docPr id="10" name="Picture 10"/>
+            <wp:cNvGraphicFramePr>
+              <a:graphicFrameLocks noChangeAspect="1"/>
+            </wp:cNvGraphicFramePr>
+            <a:graphic>
+              <a:graphicData uri="http://schemas.openxmlformats.org/drawingml/2006/picture">
+                <pic:pic>
+                  <pic:nvPicPr>
+                    <pic:cNvPr id="0" name="jira-06-kan60-hu10.jpg"/>
+                    <pic:cNvPicPr/>
+                  </pic:nvPicPr>
+                  <pic:blipFill>
+                    <a:blip r:embed="rId19"/>
+                    <a:stretch>
+                      <a:fillRect/>
+                    </a:stretch>
+                  </pic:blipFill>
+                  <pic:spPr>
+                    <a:xfrm>
+                      <a:off x="0" y="0"/>
+                      <a:ext cx="5486400" cy="2308980"/>
+                    </a:xfrm>
+                    <a:prstGeom prst="rect"/>
+                  </pic:spPr>
+                </pic:pic>
+              </a:graphicData>
+            </a:graphic>
+          </wp:inline>
+        </w:drawing>
+      </w:r>
+    </w:p>
+    <w:p>
+      <w:pPr>
+        <w:pStyle w:val="APA"/>
+        <w:ind w:firstLine="0"/>
+        <w:jc w:val="left"/>
+      </w:pPr>
+      <w:r>
+        <w:rPr>
+          <w:i/>
+        </w:rPr>
+        <w:t>Nota.</w:t>
+      </w:r>
+      <w:r>
+        <w:t xml:space="preserve"> Captura de Jira. Comentario de la Guía 8 en KAN-60 con los casos aprobados y la captura de Playwright de la historia.</w:t>
+      </w:r>
+    </w:p>
+    <w:p>
+      <w:pPr>
+        <w:pStyle w:val="APA"/>
+        <w:keepNext/>
+        <w:ind w:firstLine="0"/>
+      </w:pPr>
+      <w:r>
+        <w:rPr>
+          <w:b/>
+        </w:rPr>
+        <w:t>Figura 11</w:t>
+      </w:r>
+    </w:p>
+    <w:p>
+      <w:pPr>
+        <w:pStyle w:val="APA"/>
+        <w:keepNext/>
+        <w:ind w:firstLine="0"/>
+      </w:pPr>
+      <w:r>
+        <w:rPr>
+          <w:i/>
+        </w:rPr>
+        <w:t>Evidencia de pruebas registrada en KAN-61 (HU-11)</w:t>
+      </w:r>
+    </w:p>
+    <w:p>
+      <w:pPr>
+        <w:pStyle w:val="APA"/>
+        <w:keepNext/>
+        <w:ind w:firstLine="0"/>
+        <w:jc w:val="center"/>
+      </w:pPr>
+      <w:r>
+        <w:drawing>
+          <wp:inline xmlns:a="http://schemas.openxmlformats.org/drawingml/2006/main" xmlns:pic="http://schemas.openxmlformats.org/drawingml/2006/picture">
+            <wp:extent cx="5486400" cy="2308980"/>
+            <wp:docPr id="11" name="Picture 11"/>
+            <wp:cNvGraphicFramePr>
+              <a:graphicFrameLocks noChangeAspect="1"/>
+            </wp:cNvGraphicFramePr>
+            <a:graphic>
+              <a:graphicData uri="http://schemas.openxmlformats.org/drawingml/2006/picture">
+                <pic:pic>
+                  <pic:nvPicPr>
+                    <pic:cNvPr id="0" name="jira-07-kan61-hu11.jpg"/>
+                    <pic:cNvPicPr/>
+                  </pic:nvPicPr>
+                  <pic:blipFill>
+                    <a:blip r:embed="rId20"/>
+                    <a:stretch>
+                      <a:fillRect/>
+                    </a:stretch>
+                  </pic:blipFill>
+                  <pic:spPr>
+                    <a:xfrm>
+                      <a:off x="0" y="0"/>
+                      <a:ext cx="5486400" cy="2308980"/>
+                    </a:xfrm>
+                    <a:prstGeom prst="rect"/>
+                  </pic:spPr>
+                </pic:pic>
+              </a:graphicData>
+            </a:graphic>
+          </wp:inline>
+        </w:drawing>
+      </w:r>
+    </w:p>
+    <w:p>
+      <w:pPr>
+        <w:pStyle w:val="APA"/>
+        <w:ind w:firstLine="0"/>
+        <w:jc w:val="left"/>
+      </w:pPr>
+      <w:r>
+        <w:rPr>
+          <w:i/>
+        </w:rPr>
+        <w:t>Nota.</w:t>
+      </w:r>
+      <w:r>
+        <w:t xml:space="preserve"> Captura de Jira. Comentario de la Guía 8 en KAN-61 con los casos aprobados y la captura de Playwright de la historia.</w:t>
+      </w:r>
+    </w:p>
+    <w:p>
+      <w:pPr>
+        <w:pStyle w:val="APA"/>
         <w:pageBreakBefore/>
         <w:ind w:firstLine="0"/>
         <w:jc w:val="center"/>
@@ -6219,7 +6844,7 @@
       <w:r>
         <w:t xml:space="preserve">Repositorio en GitHub: </w:t>
       </w:r>
-      <w:hyperlink r:id="rId14">
+      <w:hyperlink r:id="rId21">
         <w:r>
           <w:rPr>
             <w:color w:val="0563C1"/>
@@ -6241,7 +6866,7 @@
       <w:r>
         <w:t xml:space="preserve">Rama del Sprint 3: </w:t>
       </w:r>
-      <w:hyperlink r:id="rId15">
+      <w:hyperlink r:id="rId22">
         <w:r>
           <w:rPr>
             <w:color w:val="0563C1"/>
@@ -6263,7 +6888,7 @@
       <w:r>
         <w:t xml:space="preserve">Ejecución exitosa de las pruebas en GitHub Actions: </w:t>
       </w:r>
-      <w:hyperlink r:id="rId16">
+      <w:hyperlink r:id="rId23">
         <w:r>
           <w:rPr>
             <w:color w:val="0563C1"/>
@@ -6285,7 +6910,7 @@
       <w:r>
         <w:t xml:space="preserve">Historial del flujo de construcción: </w:t>
       </w:r>
-      <w:hyperlink r:id="rId17">
+      <w:hyperlink r:id="rId24">
         <w:r>
           <w:rPr>
             <w:color w:val="0563C1"/>
@@ -6307,7 +6932,7 @@
       <w:r>
         <w:t xml:space="preserve">Pruebas de integración del backend: </w:t>
       </w:r>
-      <w:hyperlink r:id="rId18">
+      <w:hyperlink r:id="rId25">
         <w:r>
           <w:rPr>
             <w:color w:val="0563C1"/>
@@ -6329,7 +6954,7 @@
       <w:r>
         <w:t xml:space="preserve">Pruebas de la interfaz con Playwright: </w:t>
       </w:r>
-      <w:hyperlink r:id="rId19">
+      <w:hyperlink r:id="rId26">
         <w:r>
           <w:rPr>
             <w:color w:val="0563C1"/>
@@ -6351,7 +6976,7 @@
       <w:r>
         <w:t xml:space="preserve">Plan de pruebas y evidencias: </w:t>
       </w:r>
-      <w:hyperlink r:id="rId20">
+      <w:hyperlink r:id="rId27">
         <w:r>
           <w:rPr>
             <w:color w:val="0563C1"/>
@@ -6373,7 +6998,7 @@
       <w:r>
         <w:t xml:space="preserve">Comparación para el Pull Request hacia develop: </w:t>
       </w:r>
-      <w:hyperlink r:id="rId21">
+      <w:hyperlink r:id="rId28">
         <w:r>
           <w:rPr>
             <w:color w:val="0563C1"/>
@@ -6395,7 +7020,7 @@
       <w:r>
         <w:t xml:space="preserve">Interfaz publicada en GitHub Pages: </w:t>
       </w:r>
-      <w:hyperlink r:id="rId22">
+      <w:hyperlink r:id="rId29">
         <w:r>
           <w:rPr>
             <w:color w:val="0563C1"/>
@@ -6417,7 +7042,7 @@
       <w:r>
         <w:t xml:space="preserve">Tablero en Jira: </w:t>
       </w:r>
-      <w:hyperlink r:id="rId23">
+      <w:hyperlink r:id="rId30">
         <w:r>
           <w:rPr>
             <w:color w:val="0563C1"/>
@@ -6439,7 +7064,7 @@
       <w:r>
         <w:t xml:space="preserve">Épica del Sprint 3 en Jira (KAN-56): </w:t>
       </w:r>
-      <w:hyperlink r:id="rId24">
+      <w:hyperlink r:id="rId31">
         <w:r>
           <w:rPr>
             <w:color w:val="0563C1"/>
@@ -6461,7 +7086,7 @@
       <w:r>
         <w:t xml:space="preserve">Documentación arc42 en Notion: </w:t>
       </w:r>
-      <w:hyperlink r:id="rId25">
+      <w:hyperlink r:id="rId32">
         <w:r>
           <w:rPr>
             <w:color w:val="0563C1"/>
@@ -6483,7 +7108,7 @@
       <w:r>
         <w:t xml:space="preserve">Diseño de las pantallas en Figma: </w:t>
       </w:r>
-      <w:hyperlink r:id="rId26">
+      <w:hyperlink r:id="rId33">
         <w:r>
           <w:rPr>
             <w:color w:val="0563C1"/>

</xml_diff>